<commit_message>
docs: align multistore report with final verification boundaries
</commit_message>
<xml_diff>
--- a/docs/database/multi-store-architecture-report.docx
+++ b/docs/database/multi-store-architecture-report.docx
@@ -97,10 +97,10 @@
           <w:noProof/>
         </w:rPr>
         <w:drawing>
-          <wp:inline distT="0" distB="0" distL="0" distR="0" wp14:anchorId="5BBF7370" wp14:editId="6B8E0F70">
+          <wp:inline distT="0" distB="0" distL="0" distR="0" wp14:anchorId="65119349" wp14:editId="44108D17">
             <wp:extent cx="6400800" cy="3302000"/>
             <wp:effectExtent l="0" t="0" r="0" b="0"/>
-            <wp:docPr id="915116391" name="图形 1"/>
+            <wp:docPr id="529073137" name="图形 1"/>
             <wp:cNvGraphicFramePr>
               <a:graphicFrameLocks xmlns:a="http://schemas.openxmlformats.org/drawingml/2006/main" noChangeAspect="1"/>
             </wp:cNvGraphicFramePr>
@@ -108,7 +108,7 @@
               <a:graphicData uri="http://schemas.openxmlformats.org/drawingml/2006/picture">
                 <pic:pic xmlns:pic="http://schemas.openxmlformats.org/drawingml/2006/picture">
                   <pic:nvPicPr>
-                    <pic:cNvPr id="915116391" name=""/>
+                    <pic:cNvPr id="529073137" name=""/>
                     <pic:cNvPicPr/>
                   </pic:nvPicPr>
                   <pic:blipFill>
@@ -3095,7 +3095,7 @@
         <w:rPr>
           <w:rFonts w:hint="eastAsia"/>
         </w:rPr>
-        <w:t>资料库分别管理设备型号和文档。型号记录包含完整型号、厂家、固件、适用范围、能力、协议、离线约束与证据版本；未知实际参数保留为空。物理设备通过独立的受控关联指向型号。关联型号不等于设备已经安装、接通或验收。</w:t>
+        <w:t>资料库分别管理设备型号和文档。型号记录包含完整型号、厂家、硬件与固件版本、设备类别、适用范围、能力、协议、离线约束与证据版本；未知实际参数保留为空。物理设备通过独立的受控关联指向型号。关联型号不等于设备已经安装、接通或验收。</w:t>
       </w:r>
     </w:p>
     <w:p>
@@ -3108,7 +3108,7 @@
         <w:rPr>
           <w:rFonts w:hint="eastAsia"/>
         </w:rPr>
-        <w:t>文档保存原件版本与哈希、来源 URI、来源版本、许可、发布日期、摘要及关联对象或术语。文件原件继续通过统一文件服务访问。资料查询、详情、历史和版本列表均检查当前权限及其关联资源；已过期的专业索引不能成为继续读取的授权依据。</w:t>
+        <w:t>文档保存原件版本与哈希、来源 URI、来源版本、许可、发布日期、作者或机构、适用农业场景、语言、摘要整理人及关联对象或术语。文件原件继续通过统一文件服务访问。资料查询、详情、历史和版本列表均检查当前权限及其关联资源；已过期的专业索引不能成为继续读取的授权依据。</w:t>
       </w:r>
     </w:p>
     <w:p>
@@ -3121,7 +3121,7 @@
         <w:rPr>
           <w:rFonts w:hint="eastAsia"/>
         </w:rPr>
-        <w:t>草稿可持续编辑，已核验或其他非草稿状态的关键变更通过已有独立审批执行。能力核验重用受控证据服务，并保留原证据版本。参考本体以精确的资料修订和事件引用进入本体草稿，再经过已有审核与发布流程；导入资料不会直接发布本体定义。空的新增引用字段允许省略，以保留既有文档摘要与前端兼容性。</w:t>
+        <w:t>草稿可持续编辑，已核验或其他非草稿状态的关键变更通过已有独立审批执行。能力核验重用受控证据服务，并保留原证据版本。参考本体以精确的资料修订和事件引用进入本体草稿，再经过已有审核与发布流程；导入资料不会直接发布本体定义。新增可选元数据不补写旧接受事件，也不改变原载荷或摘要。</w:t>
       </w:r>
     </w:p>
     <w:p>
@@ -3215,7 +3215,7 @@
         <w:rPr>
           <w:rFonts w:hint="eastAsia"/>
         </w:rPr>
-        <w:t>输入保留来源与记录版本、设备与测点、指标、原始和标准化值及单位、观测时间、上报时间、服务端接收时间、质量标记和依据引用。数字使用精确十进制表达，空值、零值与未知不能混为一谈。历史记录指向当时的型号关联和几何版本，不以今天的设备归属覆盖过去。对于早于已知型号关联的样本，缺失的历史型号保留未知。</w:t>
+        <w:t>输入保留来源与记录版本、设备与测点、指标、原始和标准化值及单位、采样及上报时间、服务端接收时间、质量标记和依据引用。测量方法、校准版本和时间质量分别登记；录像索引可保存已知编码、分辨率、录像序号、缺口和核验状态。未知值保持为空。数字使用精确十进制表达，空值、零值与未知不能混同。历史记录引用当时的型号关联和几何版本，不以今天的设备归属或固件资料覆盖过去。</w:t>
       </w:r>
     </w:p>
     <w:p>
@@ -3267,11 +3267,31 @@
         <w:rPr>
           <w:rFonts w:hint="eastAsia"/>
         </w:rPr>
-        <w:t>查询提供时间与 ID 游标，并在分页前检查当前关联权限。媒体按片段与查询区间的相交关系检索。统计明确限定为当前返回页；当前候选扫描有上限，超过时要求缩小区间，这属于查询保护，不代表总存储容量。迟到数据落在已消费游标之前时需要重新查询该时间段。保留策略目前提供预览，不自动销毁样本、文件、证据或分区。</w:t>
+        <w:t>查询提供时间与 ID 游标，在分页前检查当前关联权限并按选定质量筛选；统计仅覆盖实际返回页，改变筛选条件需重新分页。媒体按片段与查询区间相交检索。候选扫描上限属于查询保护，不是总存储容量。迟到数据落在已消费游标之前时需重查该区间。保留预览与受控归档均不自动销毁样本、文件、证据或分区。</w:t>
       </w:r>
     </w:p>
     <w:p>
       <w:pPr>
+        <w:rPr>
+          <w:rFonts w:hint="eastAsia"/>
+        </w:rPr>
+      </w:pPr>
+      <w:r>
+        <w:rPr>
+          <w:rFonts w:hint="eastAsia"/>
+        </w:rPr>
+        <w:t>受控归档按对象、来源、类型、质量和截止时间选取有界记录，保留确切记录版本、摘要、原载荷与筛选条件，并形成私有文件和审计。未同步、缺失权限或超过单次范围时明确拒绝。原库记录及当前值保</w:t>
+      </w:r>
+      <w:r>
+        <w:rPr>
+          <w:rFonts w:hint="eastAsia"/>
+        </w:rPr>
+        <w:lastRenderedPageBreak/>
+        <w:t>持不变；读取归档仍复核当前对象、来源和证据权限。此功能用于保留可追溯副本，不释放原库磁盘，也不替代整个平台备份。</w:t>
+      </w:r>
+    </w:p>
+    <w:p>
+      <w:pPr>
         <w:pStyle w:val="2"/>
         <w:rPr>
           <w:rFonts w:hint="eastAsia"/>
@@ -3281,7 +3301,6 @@
         <w:rPr>
           <w:rFonts w:hint="eastAsia"/>
         </w:rPr>
-        <w:lastRenderedPageBreak/>
         <w:t>静态先行 按型号与用途接入动态数据</w:t>
       </w:r>
     </w:p>
@@ -3751,8 +3770,15 @@
         <w:rPr>
           <w:rFonts w:hint="eastAsia"/>
         </w:rPr>
-        <w:t>有语义价值的事件可以通过现有事实编辑与治理流程形成明确选取的摘要，并引用原始接受批次、记录版本、摘要和观测时间。该路径检查当前来源及关联文件权限；重试产生新的审计版本，也不能替换原始证据引用。所选批次未入库、失败或已入库但尚未确认时，相关 RDF 发布继续等待或显式失败。确认后才可发布，无关原始批次不会阻塞它。此能力已经用真实 Fuseki 验证，但不等于自动把所有遥测值提升为已采纳事实。</w:t>
+        <w:t>有语义价值的事件可以通过现有事实编辑与治理流程形成明确选取的摘要，并引用原始接受批次、记录版本、摘要和观测时间。该路径检查当前来源及关联文件权限；重试产生新的审计版本，也不能替换原</w:t>
       </w:r>
+      <w:r>
+        <w:rPr>
+          <w:rFonts w:hint="eastAsia"/>
+        </w:rPr>
+        <w:lastRenderedPageBreak/>
+        <w:t>始证据引用。所选批次未入库、失败或已入库但尚未确认时，相关 RDF 发布继续等待或显式失败。确认后才可发布，无关原始批次不会阻塞它。此能力已经用真实 Fuseki 验证，但不等于自动把所有遥测值提升为已采纳事实。</w:t>
+      </w:r>
     </w:p>
     <w:p>
       <w:pPr>
@@ -3765,7 +3791,6 @@
         <w:rPr>
           <w:rFonts w:hint="eastAsia"/>
         </w:rPr>
-        <w:lastRenderedPageBreak/>
         <w:t>迁移切换与备份恢复</w:t>
       </w:r>
     </w:p>
@@ -3871,6 +3896,7 @@
         <w:rPr>
           <w:rFonts w:hint="eastAsia"/>
         </w:rPr>
+        <w:lastRenderedPageBreak/>
         <w:t>验证范围与结果</w:t>
       </w:r>
     </w:p>
@@ -3938,7 +3964,6 @@
                 <w:b/>
                 <w:sz w:val="21"/>
               </w:rPr>
-              <w:lastRenderedPageBreak/>
               <w:t>验证领域</w:t>
             </w:r>
           </w:p>
@@ -4242,7 +4267,7 @@
                 <w:rFonts w:hint="eastAsia"/>
                 <w:sz w:val="21"/>
               </w:rPr>
-              <w:t>真实 GIS 索引、权限撤销、旧历史补写、来源撤回和等待依赖后发布到 Fuseki</w:t>
+              <w:t>真实 GIS 索引、撤权、迟到历史、来源撤回和依赖后发布；资产文件故障不能误报当前空列表</w:t>
             </w:r>
           </w:p>
         </w:tc>
@@ -4311,7 +4336,7 @@
                 <w:rFonts w:hint="eastAsia"/>
                 <w:sz w:val="21"/>
               </w:rPr>
-              <w:t>真实资料投影、受控证据、独立审核、精确历史型号及参考资料版本；前端契约兼容</w:t>
+              <w:t>资料投影、结构化来源元数据、受控证据、独立审核、精确历史型号及参考资料版本；旧载荷摘要保持不变</w:t>
             </w:r>
           </w:p>
         </w:tc>
@@ -4380,7 +4405,7 @@
                 <w:rFonts w:hint="eastAsia"/>
                 <w:sz w:val="21"/>
               </w:rPr>
-              <w:t>UTC 月分区；精确小数、空值与零；更正和撤回；历史引用与权限撤销；超过查询预算时提供可用的范围查询入口</w:t>
+              <w:t>UTC 分区、精确小数与空值；质量筛选及分页统计、更正撤回、历史引用、受控归档与撤权；查询预算明确可见</w:t>
             </w:r>
           </w:p>
         </w:tc>
@@ -4449,7 +4474,7 @@
                 <w:rFonts w:hint="eastAsia"/>
                 <w:sz w:val="21"/>
               </w:rPr>
-              <w:t>同机独立 PostgreSQL 实例间的新库恢复；SQL、RDF、文件及历史引用核对；审批回滚、四库绑定与配置发布故障恢复</w:t>
+              <w:t>独立 PostgreSQL 实例间恢复，包含空间资产与位置记录；SQL、RDF、文件、历史核对；审批回滚与配置发布故障恢复</w:t>
             </w:r>
           </w:p>
         </w:tc>
@@ -4522,27 +4547,27 @@
         <w:rPr>
           <w:rFonts w:hint="eastAsia"/>
         </w:rPr>
-        <w:t>首次综合功能批次收集 53 个用例，使用独立 SQL 库、真实 Fuseki 与本地私有文件存储，结果为 50 项通过、3 项失败，耗时 3435.08 秒。三项失败分别涉及共享实体场景的投影任务超时、有效期在测试准备期间已届满，以及直接投影调用未先执行 GIS 交付。原始结果予以保留；后续针对修改路径的验证另行记录，不把多轮结果合并描述为单轮全部通过，也不把该批次称为 S3 验收。</w:t>
-      </w:r>
-    </w:p>
-    <w:p>
-      <w:pPr>
-        <w:rPr>
-          <w:rFonts w:hint="eastAsia"/>
-        </w:rPr>
-      </w:pPr>
-      <w:r>
-        <w:rPr>
-          <w:rFonts w:hint="eastAsia"/>
-        </w:rPr>
-        <w:t>共享实体诊断记录到三次 JOB_BATCH_TIMEOUT；两次完整投影批次分别耗时 162.645 秒和 161.907 秒。当前授权与 GIS 交付均有效；远端 RDF 已写入时，超时没有错误推进 SQL 投影水位。原场景预算为 120 秒、租约 180 秒，生产默认值为 30 秒和 60 秒。复测采用现有配置项明确设置 240 秒和 300 秒，完整的农田、水塘、共享设备、动态类型发布与重算流程通过，耗时 857.04 秒。实际后台服</w:t>
+        <w:t>首次综合功能批次收集 53 个用例，使用独立 SQL 库、真实 Fuseki 与本地私有文件存储，结果为 50 项通过、3 项失败，耗时 3435.08 秒。三项失败分别涉及共享实体场景的投影任务超时、有效期在测试</w:t>
       </w:r>
       <w:r>
         <w:rPr>
           <w:rFonts w:hint="eastAsia"/>
         </w:rPr>
         <w:lastRenderedPageBreak/>
-        <w:t>务的验收要求使用同一声明配置。该结果证明这一配置下的功能正确性，不证明生产默认配置适用，也不表示投影性能达标。</w:t>
+        <w:t>准备期间已届满，以及直接投影调用未先执行 GIS 交付。原始结果予以保留；后续针对修改路径的验证另行记录，不把多轮结果合并描述为单轮全部通过，也不把该批次称为 S3 验收。</w:t>
+      </w:r>
+    </w:p>
+    <w:p>
+      <w:pPr>
+        <w:rPr>
+          <w:rFonts w:hint="eastAsia"/>
+        </w:rPr>
+      </w:pPr>
+      <w:r>
+        <w:rPr>
+          <w:rFonts w:hint="eastAsia"/>
+        </w:rPr>
+        <w:t>共享实体诊断记录到三次 JOB_BATCH_TIMEOUT；两次完整投影批次分别耗时 162.645 秒和 161.907 秒。当前授权与 GIS 交付均有效；远端 RDF 已写入时，超时没有错误推进 SQL 投影水位。原场景预算为 120 秒、租约 180 秒，生产默认值为 30 秒和 60 秒。复测采用现有配置项明确设置 240 秒和 300 秒，完整的农田、水塘、共享设备、动态类型发布与重算流程通过，耗时 857.04 秒。实际后台服务的验收要求使用同一声明配置。该结果证明这一配置下的功能正确性，不证明生产默认配置适用，也不表示投影性能达标。</w:t>
       </w:r>
     </w:p>
     <w:p>
@@ -4648,20 +4673,27 @@
         <w:rPr>
           <w:rFonts w:hint="eastAsia"/>
         </w:rPr>
-        <w:t>实测代码为干净提交 717b07f。SQL 中的一万个实体与十万条已采纳关系、RDF 中的相同数量，以及一万个投影头、GIS 版本和精确交付确认均完成核对。准备这些数据耗时 237.869 秒；另外通过真实路径写入 100 条观测和 1 条媒体记录，媒体原件为 4096 字节的不可播放合成数据，耗时 21.145 秒。数据准备与接口测量分别计时，不能把直接安装的合成 SQL 与 RDF 数据解释为 API 批量导入吞吐。</w:t>
+        <w:t>实测代码为干净提交 717b07f。SQL 中的一万个实体与十万条已采纳关系、RDF 中的相同数量，以及一万个投影头、GIS 版本和精确交付确认均完成核对。准备这些数据耗时 237.869 秒；另外通过真实路</w:t>
       </w:r>
-    </w:p>
-    <w:p>
-      <w:pPr>
-        <w:rPr>
-          <w:rFonts w:hint="eastAsia"/>
-        </w:rPr>
-      </w:pPr>
       <w:r>
         <w:rPr>
           <w:rFonts w:hint="eastAsia"/>
         </w:rPr>
-        <w:t>测量使用进程内 ASGI 请求和真实 SQL、Fuseki、S3 访问，保留后端当前授权检查。十个用户具有不同的持久化身份与会话；身份安装属于测试准备，测量不包含浏览器网络、真实 OIDC 登录或视频播放。每项操作运行一轮，共十个样本，没有额外预热；此前运行可能已经影响缓存，因此不称为冷缓存试验。样本量只支持初始刻画。</w:t>
+        <w:lastRenderedPageBreak/>
+        <w:t>径写入 100 条观测和 1 条媒体记录，媒体原件为 4096 字节的不可播放合成数据，耗时 21.145 秒。数据准备与接口测量分别计时，不能把直接安装的合成 SQL 与 RDF 数据解释为 API 批量导入吞吐。</w:t>
+      </w:r>
+    </w:p>
+    <w:p>
+      <w:pPr>
+        <w:rPr>
+          <w:rFonts w:hint="eastAsia"/>
+        </w:rPr>
+      </w:pPr>
+      <w:r>
+        <w:rPr>
+          <w:rFonts w:hint="eastAsia"/>
+        </w:rPr>
+        <w:t>测量使用进程内 ASGI 请求和真实 SQL、Fuseki、S3 访问，保留后端当前授权检查。十个用户具有不同的持久化身份与会话；测量不包含浏览器网络、真实 OIDC 登录或视频播放。每项操作一轮、十个样本，无额外预热；此前运行可能影响缓存，不能称为冷缓存试验。测量用户没有来源读取权限，因此专业数据子区段未返回已写入的观测和媒体；对应延迟不证明有权用户读取非空时序或媒体的性能。后续驱动增加预检，不改写本次原始结果。</w:t>
       </w:r>
     </w:p>
     <w:tbl>
@@ -4715,7 +4747,6 @@
                 <w:b/>
                 <w:sz w:val="21"/>
               </w:rPr>
-              <w:lastRenderedPageBreak/>
               <w:t>操作</w:t>
             </w:r>
           </w:p>
@@ -5277,7 +5308,7 @@
                 <w:rFonts w:hint="eastAsia"/>
                 <w:sz w:val="21"/>
               </w:rPr>
-              <w:t>对象关联的专业数据</w:t>
+              <w:t>专业数据视图 观测与媒体不可见</w:t>
             </w:r>
           </w:p>
         </w:tc>
@@ -5538,6 +5569,7 @@
                 <w:b/>
                 <w:sz w:val="21"/>
               </w:rPr>
+              <w:lastRenderedPageBreak/>
               <w:t>选定进程</w:t>
             </w:r>
           </w:p>
@@ -6122,6 +6154,7 @@
                 <w:rFonts w:hint="eastAsia"/>
                 <w:sz w:val="21"/>
               </w:rPr>
+              <w:lastRenderedPageBreak/>
               <w:t>Q02</w:t>
             </w:r>
           </w:p>
@@ -6377,7 +6410,6 @@
                 <w:rFonts w:hint="eastAsia"/>
                 <w:sz w:val="21"/>
               </w:rPr>
-              <w:lastRenderedPageBreak/>
               <w:t>Q05</w:t>
             </w:r>
           </w:p>
@@ -6973,6 +7005,7 @@
                 <w:rFonts w:hint="eastAsia"/>
                 <w:sz w:val="21"/>
               </w:rPr>
+              <w:lastRenderedPageBreak/>
               <w:t>Q12</w:t>
             </w:r>
           </w:p>
@@ -7143,7 +7176,6 @@
                 <w:rFonts w:hint="eastAsia"/>
                 <w:sz w:val="21"/>
               </w:rPr>
-              <w:lastRenderedPageBreak/>
               <w:t>Q14</w:t>
             </w:r>
           </w:p>
@@ -7607,7 +7639,8 @@
         <w:rPr>
           <w:rFonts w:hint="eastAsia"/>
         </w:rPr>
-        <w:t>关联工程 No1dry/liangzihu-farm-platform，检查提交 113e6491c488ebb3fc0529cf56c446e69274ce4f。参考地形成果迁移、三维与测绘资料操作卡、真实资料与设备适配交接记录；其中未实现的设备驱动与采购数量不能当作现场接通或实装证据。https://github.com/No1dry/liangzihu-farm-platform/tree/113e6491c488ebb3fc0529cf56c446e69274ce4f</w:t>
+        <w:lastRenderedPageBreak/>
+        <w:t>地形与设备交接参考：成果迁移、测绘操作卡和适配记录。未实现的驱动与采购数量不代表现场验收。固定版本 https://github.com/No1dry/liangzihu-farm-platform/tree/113e6491c488ebb3fc0529cf56c446e69274ce4f</w:t>
       </w:r>
     </w:p>
     <w:p>
@@ -7620,14 +7653,7 @@
         <w:rPr>
           <w:rFonts w:hint="eastAsia"/>
         </w:rPr>
-        <w:t>关联工程 lianggeming14/liangzihu-ontology-traceability，检查提交 11686c54375af9bf4450c3e1cbc237cd003bdaf7。参考设备平台映射与原有多模态资料中的问题线索；</w:t>
-      </w:r>
-      <w:r>
-        <w:rPr>
-          <w:rFonts w:hint="eastAsia"/>
-        </w:rPr>
-        <w:lastRenderedPageBreak/>
-        <w:t>其架构不替代本次批准方案。https://github.com/lianggeming14/liangzihu-ontology-traceability/tree/11686c54375af9bf4450c3e1cbc237cd003bdaf7</w:t>
+        <w:t>设备映射与多模态问题线索参考以下固定版本，其原架构不替代本次批准方案。https://github.com/lianggeming14/liangzihu-ontology-traceability/tree/11686c54375af9bf4450c3e1cbc237cd003bdaf7</w:t>
       </w:r>
     </w:p>
     <w:p>
@@ -7653,7 +7679,7 @@
         <w:rPr>
           <w:rFonts w:hint="eastAsia"/>
         </w:rPr>
-        <w:t>设备与地理资料参考：ONVIF Profile T https://www.onvif.org/profiles/profile-t/ 与 Profile G https://www.onvif.org/profiles/profile-g/；DJI Cloud API https://developer.dji.com/cloud-api/；STAC 规范 https://stacspec.org/en/about/stac-spec/。这些为后续按型号适配和成果目录扩展提供参考，首版未据此宣称真实设备已经接入。</w:t>
+        <w:t>设备与地理资料：ONVIF Profile T https://www.onvif.org/profiles/profile-t/ 与 Profile G https://www.onvif.org/profiles/profile-g/；DJI Cloud API https://developer.dji.com/cloud-api/；STAC https://stacspec.org/en/about/stac-spec/。用于后续适配参考，未完成真实设备联调。</w:t>
       </w:r>
     </w:p>
     <w:p>
@@ -7666,7 +7692,7 @@
         <w:rPr>
           <w:rFonts w:hint="eastAsia"/>
         </w:rPr>
-        <w:t>语义资料参考：W3C Semantic Sensor Network Ontology，2017 年 10 月 19 日推荐标准 https://www.w3.org/TR/2017/REC-vocab-ssn-20171019/。资料库示例使用原创的 CC0 测试内容和固定出处引用；采纳真实专业本体时仍需核对来源、许可、术语映射和发布审批。</w:t>
+        <w:t>语义资料：W3C SSN 2017 https://www.w3.org/TR/2017/REC-vocab-ssn-20171019/。示例为原创 CC0 测试内容；真实本体须核对来源、许可、映射并审批。</w:t>
       </w:r>
     </w:p>
     <w:p>
@@ -7693,7 +7719,7 @@
         <w:rPr>
           <w:rFonts w:hint="eastAsia"/>
         </w:rPr>
-        <w:t>以下路径均相对于 GitHub 仓库根目录。先按验收说明准备各服务与私有配置，再执行所列命令；连接密码、运行目录和备份包不进入仓库。文件中保留实际执行环境及失败记录，重复验收应使用新的独立测试命名空间。</w:t>
+        <w:t>以下为仓库内入口；运行数据及密码不入库，复现使用独立命名空间。</w:t>
       </w:r>
     </w:p>
     <w:tbl>
@@ -8044,6 +8070,7 @@
             <w:pPr>
               <w:spacing w:after="40" w:line="320" w:lineRule="exact"/>
               <w:rPr>
+                <w:rFonts w:hint="eastAsia"/>
                 <w:sz w:val="21"/>
               </w:rPr>
             </w:pPr>
@@ -8053,6 +8080,21 @@
                 <w:sz w:val="21"/>
               </w:rPr>
               <w:t>docs/database/implementation-record.json</w:t>
+            </w:r>
+          </w:p>
+          <w:p>
+            <w:pPr>
+              <w:spacing w:after="40" w:line="320" w:lineRule="exact"/>
+              <w:rPr>
+                <w:sz w:val="21"/>
+              </w:rPr>
+            </w:pPr>
+            <w:r>
+              <w:rPr>
+                <w:rFonts w:hint="eastAsia"/>
+                <w:sz w:val="21"/>
+              </w:rPr>
+              <w:t>docs/database/whole-branch-fix-acceptance.json</w:t>
             </w:r>
           </w:p>
         </w:tc>
@@ -8066,21 +8108,6 @@
           <w:rFonts w:hint="eastAsia"/>
         </w:rPr>
       </w:pPr>
-    </w:p>
-    <w:p>
-      <w:pPr>
-        <w:snapToGrid/>
-        <w:spacing w:after="160" w:line="278" w:lineRule="auto"/>
-        <w:rPr>
-          <w:rFonts w:hint="eastAsia"/>
-        </w:rPr>
-      </w:pPr>
-      <w:r>
-        <w:rPr>
-          <w:rFonts w:hint="eastAsia"/>
-        </w:rPr>
-        <w:br w:type="page"/>
-      </w:r>
     </w:p>
     <w:p>
       <w:pPr>
@@ -8107,7 +8134,7 @@
         <w:rPr>
           <w:rFonts w:hint="eastAsia"/>
         </w:rPr>
-        <w:t>以下记录实施中的具体决定及其代价。真实资料仍需核验，关键操作必须获得授权，历史不能因切换丢失。完整决定记录与最终验证结果一并保留。</w:t>
+        <w:t>以下按实施顺序列出决定及调整代价，完整记录见实施记录文件。</w:t>
       </w:r>
     </w:p>
     <w:tbl>
@@ -8700,7 +8727,54 @@
                 <w:rFonts w:hint="eastAsia"/>
                 <w:sz w:val="21"/>
               </w:rPr>
-              <w:t>旧部署需一次人工核实停机及运维过渡；不能依靠 PID 相同自动接管。</w:t>
+              <w:t>旧部署需人工核实停机，不能仅凭 PID 接管。</w:t>
+            </w:r>
+          </w:p>
+        </w:tc>
+      </w:tr>
+      <w:tr>
+        <w:trPr>
+          <w:cantSplit/>
+        </w:trPr>
+        <w:tc>
+          <w:tcPr>
+            <w:tcW w:w="6700" w:type="dxa"/>
+            <w:vAlign w:val="center"/>
+          </w:tcPr>
+          <w:p>
+            <w:pPr>
+              <w:spacing w:after="40" w:line="320" w:lineRule="exact"/>
+              <w:rPr>
+                <w:sz w:val="21"/>
+              </w:rPr>
+            </w:pPr>
+            <w:r>
+              <w:rPr>
+                <w:rFonts w:hint="eastAsia"/>
+                <w:sz w:val="21"/>
+              </w:rPr>
+              <w:t>12  按已确认设计补充有权限与审计的非破坏性归档，保留原记录、版本与证据，不先设定业务保留期。</w:t>
+            </w:r>
+          </w:p>
+        </w:tc>
+        <w:tc>
+          <w:tcPr>
+            <w:tcW w:w="3380" w:type="dxa"/>
+            <w:vAlign w:val="center"/>
+          </w:tcPr>
+          <w:p>
+            <w:pPr>
+              <w:spacing w:after="40" w:line="320" w:lineRule="exact"/>
+              <w:rPr>
+                <w:sz w:val="21"/>
+              </w:rPr>
+            </w:pPr>
+            <w:r>
+              <w:rPr>
+                <w:rFonts w:hint="eastAsia"/>
+                <w:sz w:val="21"/>
+              </w:rPr>
+              <w:t>增加存储副本；需分批选择，不能自动回收空间。</w:t>
             </w:r>
           </w:p>
         </w:tc>
@@ -8717,8 +8791,11 @@
     </w:p>
     <w:p>
       <w:pPr>
-        <w:spacing w:line="240" w:lineRule="auto"/>
+        <w:spacing w:after="0" w:line="20" w:lineRule="exact"/>
         <w:jc w:val="center"/>
+        <w:rPr>
+          <w:sz w:val="2"/>
+        </w:rPr>
       </w:pPr>
     </w:p>
     <w:sectPr>
@@ -9322,7 +9399,7 @@
     <w:link w:val="10"/>
     <w:uiPriority w:val="9"/>
     <w:qFormat/>
-    <w:rsid w:val="00CE70B3"/>
+    <w:rsid w:val="009842CC"/>
     <w:pPr>
       <w:keepNext/>
       <w:keepLines/>
@@ -9344,7 +9421,7 @@
     <w:uiPriority w:val="9"/>
     <w:unhideWhenUsed/>
     <w:qFormat/>
-    <w:rsid w:val="00CE70B3"/>
+    <w:rsid w:val="009842CC"/>
     <w:pPr>
       <w:keepNext/>
       <w:keepLines/>
@@ -9367,7 +9444,7 @@
     <w:semiHidden/>
     <w:unhideWhenUsed/>
     <w:qFormat/>
-    <w:rsid w:val="00CE70B3"/>
+    <w:rsid w:val="009842CC"/>
     <w:pPr>
       <w:keepNext/>
       <w:keepLines/>
@@ -9390,7 +9467,7 @@
     <w:semiHidden/>
     <w:unhideWhenUsed/>
     <w:qFormat/>
-    <w:rsid w:val="00CE70B3"/>
+    <w:rsid w:val="009842CC"/>
     <w:pPr>
       <w:keepNext/>
       <w:keepLines/>
@@ -9413,7 +9490,7 @@
     <w:semiHidden/>
     <w:unhideWhenUsed/>
     <w:qFormat/>
-    <w:rsid w:val="00CE70B3"/>
+    <w:rsid w:val="009842CC"/>
     <w:pPr>
       <w:keepNext/>
       <w:keepLines/>
@@ -9435,7 +9512,7 @@
     <w:semiHidden/>
     <w:unhideWhenUsed/>
     <w:qFormat/>
-    <w:rsid w:val="00CE70B3"/>
+    <w:rsid w:val="009842CC"/>
     <w:pPr>
       <w:keepNext/>
       <w:keepLines/>
@@ -9458,7 +9535,7 @@
     <w:semiHidden/>
     <w:unhideWhenUsed/>
     <w:qFormat/>
-    <w:rsid w:val="00CE70B3"/>
+    <w:rsid w:val="009842CC"/>
     <w:pPr>
       <w:keepNext/>
       <w:keepLines/>
@@ -9481,7 +9558,7 @@
     <w:semiHidden/>
     <w:unhideWhenUsed/>
     <w:qFormat/>
-    <w:rsid w:val="00CE70B3"/>
+    <w:rsid w:val="009842CC"/>
     <w:pPr>
       <w:keepNext/>
       <w:keepLines/>
@@ -9502,7 +9579,7 @@
     <w:semiHidden/>
     <w:unhideWhenUsed/>
     <w:qFormat/>
-    <w:rsid w:val="00CE70B3"/>
+    <w:rsid w:val="009842CC"/>
     <w:pPr>
       <w:keepNext/>
       <w:keepLines/>
@@ -9546,7 +9623,7 @@
     <w:basedOn w:val="a0"/>
     <w:link w:val="1"/>
     <w:uiPriority w:val="9"/>
-    <w:rsid w:val="00CE70B3"/>
+    <w:rsid w:val="009842CC"/>
     <w:rPr>
       <w:rFonts w:ascii="Noto Sans SC" w:eastAsia="Noto Sans SC" w:hAnsi="Noto Sans SC" w:cstheme="majorBidi"/>
       <w:b/>
@@ -9560,7 +9637,7 @@
     <w:basedOn w:val="a0"/>
     <w:link w:val="2"/>
     <w:uiPriority w:val="9"/>
-    <w:rsid w:val="00CE70B3"/>
+    <w:rsid w:val="009842CC"/>
     <w:rPr>
       <w:rFonts w:ascii="Noto Sans SC" w:eastAsia="Noto Sans SC" w:hAnsi="Noto Sans SC" w:cstheme="majorBidi"/>
       <w:b/>
@@ -9575,7 +9652,7 @@
     <w:link w:val="3"/>
     <w:uiPriority w:val="9"/>
     <w:semiHidden/>
-    <w:rsid w:val="00CE70B3"/>
+    <w:rsid w:val="009842CC"/>
     <w:rPr>
       <w:rFonts w:ascii="Noto Sans SC" w:eastAsia="Noto Sans SC" w:hAnsi="Noto Sans SC" w:cstheme="majorBidi"/>
       <w:b/>
@@ -9590,7 +9667,7 @@
     <w:link w:val="4"/>
     <w:uiPriority w:val="9"/>
     <w:semiHidden/>
-    <w:rsid w:val="00CE70B3"/>
+    <w:rsid w:val="009842CC"/>
     <w:rPr>
       <w:rFonts w:cstheme="majorBidi"/>
       <w:color w:val="0F4761" w:themeColor="accent1" w:themeShade="BF"/>
@@ -9604,7 +9681,7 @@
     <w:link w:val="5"/>
     <w:uiPriority w:val="9"/>
     <w:semiHidden/>
-    <w:rsid w:val="00CE70B3"/>
+    <w:rsid w:val="009842CC"/>
     <w:rPr>
       <w:rFonts w:cstheme="majorBidi"/>
       <w:color w:val="0F4761" w:themeColor="accent1" w:themeShade="BF"/>
@@ -9617,7 +9694,7 @@
     <w:link w:val="6"/>
     <w:uiPriority w:val="9"/>
     <w:semiHidden/>
-    <w:rsid w:val="00CE70B3"/>
+    <w:rsid w:val="009842CC"/>
     <w:rPr>
       <w:rFonts w:cstheme="majorBidi"/>
       <w:b/>
@@ -9631,7 +9708,7 @@
     <w:link w:val="7"/>
     <w:uiPriority w:val="9"/>
     <w:semiHidden/>
-    <w:rsid w:val="00CE70B3"/>
+    <w:rsid w:val="009842CC"/>
     <w:rPr>
       <w:rFonts w:cstheme="majorBidi"/>
       <w:b/>
@@ -9645,7 +9722,7 @@
     <w:link w:val="8"/>
     <w:uiPriority w:val="9"/>
     <w:semiHidden/>
-    <w:rsid w:val="00CE70B3"/>
+    <w:rsid w:val="009842CC"/>
     <w:rPr>
       <w:rFonts w:cstheme="majorBidi"/>
       <w:color w:val="595959" w:themeColor="text1" w:themeTint="A6"/>
@@ -9657,7 +9734,7 @@
     <w:link w:val="9"/>
     <w:uiPriority w:val="9"/>
     <w:semiHidden/>
-    <w:rsid w:val="00CE70B3"/>
+    <w:rsid w:val="009842CC"/>
     <w:rPr>
       <w:rFonts w:eastAsiaTheme="majorEastAsia" w:cstheme="majorBidi"/>
       <w:color w:val="595959" w:themeColor="text1" w:themeTint="A6"/>
@@ -9670,7 +9747,7 @@
     <w:link w:val="a4"/>
     <w:uiPriority w:val="10"/>
     <w:qFormat/>
-    <w:rsid w:val="00CE70B3"/>
+    <w:rsid w:val="009842CC"/>
     <w:pPr>
       <w:keepNext/>
       <w:spacing w:after="240" w:line="640" w:lineRule="atLeast"/>
@@ -9690,7 +9767,7 @@
     <w:basedOn w:val="a0"/>
     <w:link w:val="a3"/>
     <w:uiPriority w:val="10"/>
-    <w:rsid w:val="00CE70B3"/>
+    <w:rsid w:val="009842CC"/>
     <w:rPr>
       <w:rFonts w:ascii="Noto Sans SC" w:eastAsia="Noto Sans SC" w:hAnsi="Noto Sans SC" w:cstheme="majorBidi"/>
       <w:color w:val="000000"/>
@@ -9707,7 +9784,7 @@
     <w:link w:val="a6"/>
     <w:uiPriority w:val="11"/>
     <w:qFormat/>
-    <w:rsid w:val="00CE70B3"/>
+    <w:rsid w:val="009842CC"/>
     <w:pPr>
       <w:numPr>
         <w:ilvl w:val="1"/>
@@ -9726,7 +9803,7 @@
     <w:basedOn w:val="a0"/>
     <w:link w:val="a5"/>
     <w:uiPriority w:val="11"/>
-    <w:rsid w:val="00CE70B3"/>
+    <w:rsid w:val="009842CC"/>
     <w:rPr>
       <w:rFonts w:ascii="Noto Sans SC" w:eastAsia="Noto Sans SC" w:hAnsi="Noto Sans SC" w:cstheme="majorBidi"/>
       <w:color w:val="000000"/>
@@ -9741,7 +9818,7 @@
     <w:link w:val="a8"/>
     <w:uiPriority w:val="29"/>
     <w:qFormat/>
-    <w:rsid w:val="00CE70B3"/>
+    <w:rsid w:val="009842CC"/>
     <w:pPr>
       <w:spacing w:before="160"/>
       <w:jc w:val="center"/>
@@ -9757,7 +9834,7 @@
     <w:basedOn w:val="a0"/>
     <w:link w:val="a7"/>
     <w:uiPriority w:val="29"/>
-    <w:rsid w:val="00CE70B3"/>
+    <w:rsid w:val="009842CC"/>
     <w:rPr>
       <w:i/>
       <w:iCs/>
@@ -9769,7 +9846,7 @@
     <w:basedOn w:val="a"/>
     <w:uiPriority w:val="34"/>
     <w:qFormat/>
-    <w:rsid w:val="00CE70B3"/>
+    <w:rsid w:val="009842CC"/>
     <w:pPr>
       <w:ind w:left="720"/>
       <w:contextualSpacing/>
@@ -9780,7 +9857,7 @@
     <w:basedOn w:val="a0"/>
     <w:uiPriority w:val="21"/>
     <w:qFormat/>
-    <w:rsid w:val="00CE70B3"/>
+    <w:rsid w:val="009842CC"/>
     <w:rPr>
       <w:i/>
       <w:iCs/>
@@ -9794,7 +9871,7 @@
     <w:link w:val="ac"/>
     <w:uiPriority w:val="30"/>
     <w:qFormat/>
-    <w:rsid w:val="00CE70B3"/>
+    <w:rsid w:val="009842CC"/>
     <w:pPr>
       <w:pBdr>
         <w:top w:val="single" w:sz="4" w:space="10" w:color="0F4761" w:themeColor="accent1" w:themeShade="BF"/>
@@ -9815,7 +9892,7 @@
     <w:basedOn w:val="a0"/>
     <w:link w:val="ab"/>
     <w:uiPriority w:val="30"/>
-    <w:rsid w:val="00CE70B3"/>
+    <w:rsid w:val="009842CC"/>
     <w:rPr>
       <w:i/>
       <w:iCs/>
@@ -9827,7 +9904,7 @@
     <w:basedOn w:val="a0"/>
     <w:uiPriority w:val="32"/>
     <w:qFormat/>
-    <w:rsid w:val="00CE70B3"/>
+    <w:rsid w:val="009842CC"/>
     <w:rPr>
       <w:b/>
       <w:bCs/>
@@ -9842,7 +9919,7 @@
     <w:link w:val="af"/>
     <w:uiPriority w:val="99"/>
     <w:unhideWhenUsed/>
-    <w:rsid w:val="00CE70B3"/>
+    <w:rsid w:val="009842CC"/>
     <w:pPr>
       <w:tabs>
         <w:tab w:val="center" w:pos="4153"/>
@@ -9861,7 +9938,7 @@
     <w:basedOn w:val="a0"/>
     <w:link w:val="ae"/>
     <w:uiPriority w:val="99"/>
-    <w:rsid w:val="00CE70B3"/>
+    <w:rsid w:val="009842CC"/>
     <w:rPr>
       <w:rFonts w:ascii="Noto Sans SC" w:eastAsia="Noto Sans SC" w:hAnsi="Noto Sans SC"/>
       <w:color w:val="000000"/>
@@ -9875,7 +9952,7 @@
     <w:link w:val="af1"/>
     <w:uiPriority w:val="99"/>
     <w:unhideWhenUsed/>
-    <w:rsid w:val="00CE70B3"/>
+    <w:rsid w:val="009842CC"/>
     <w:pPr>
       <w:tabs>
         <w:tab w:val="center" w:pos="4153"/>
@@ -9893,7 +9970,7 @@
     <w:basedOn w:val="a0"/>
     <w:link w:val="af0"/>
     <w:uiPriority w:val="99"/>
-    <w:rsid w:val="00CE70B3"/>
+    <w:rsid w:val="009842CC"/>
     <w:rPr>
       <w:rFonts w:ascii="Noto Sans SC" w:eastAsia="Noto Sans SC" w:hAnsi="Noto Sans SC"/>
       <w:color w:val="000000"/>

</xml_diff>